<commit_message>
kiemtraboi3.cpp trong nhanh MSSV_cpp
</commit_message>
<xml_diff>
--- a/NgoAnhKiet_DH52200948.docx
+++ b/NgoAnhKiet_DH52200948.docx
@@ -205,6 +205,46 @@
     </w:p>
     <w:p>
       <w:r>
+        <w:drawing>
+          <wp:inline distT="0" distB="0" distL="0" distR="0" wp14:anchorId="1EC80043" wp14:editId="79BED5A4">
+            <wp:extent cx="5534797" cy="3524742"/>
+            <wp:effectExtent l="0" t="0" r="0" b="0"/>
+            <wp:docPr id="39201863" name="Picture 1" descr="A computer screen shot of a program&#10;&#10;Description automatically generated"/>
+            <wp:cNvGraphicFramePr>
+              <a:graphicFrameLocks xmlns:a="http://schemas.openxmlformats.org/drawingml/2006/main" noChangeAspect="1"/>
+            </wp:cNvGraphicFramePr>
+            <a:graphic xmlns:a="http://schemas.openxmlformats.org/drawingml/2006/main">
+              <a:graphicData uri="http://schemas.openxmlformats.org/drawingml/2006/picture">
+                <pic:pic xmlns:pic="http://schemas.openxmlformats.org/drawingml/2006/picture">
+                  <pic:nvPicPr>
+                    <pic:cNvPr id="39201863" name="Picture 1" descr="A computer screen shot of a program&#10;&#10;Description automatically generated"/>
+                    <pic:cNvPicPr/>
+                  </pic:nvPicPr>
+                  <pic:blipFill>
+                    <a:blip r:embed="rId5"/>
+                    <a:stretch>
+                      <a:fillRect/>
+                    </a:stretch>
+                  </pic:blipFill>
+                  <pic:spPr>
+                    <a:xfrm>
+                      <a:off x="0" y="0"/>
+                      <a:ext cx="5534797" cy="3524742"/>
+                    </a:xfrm>
+                    <a:prstGeom prst="rect">
+                      <a:avLst/>
+                    </a:prstGeom>
+                  </pic:spPr>
+                </pic:pic>
+              </a:graphicData>
+            </a:graphic>
+          </wp:inline>
+        </w:drawing>
+      </w:r>
+    </w:p>
+    <w:p>
+      <w:r>
+        <w:lastRenderedPageBreak/>
         <w:t>- Trong nhánh MSSV_cpp chứa chương trình kiểm tra 1 số nguyên nhập vào có phải là bội số của 3 không viết bằng C++.</w:t>
       </w:r>
     </w:p>

</xml_diff>

<commit_message>
create kiemtraboi3.sh on DH52200948.sh
</commit_message>
<xml_diff>
--- a/NgoAnhKiet_DH52200948.docx
+++ b/NgoAnhKiet_DH52200948.docx
@@ -182,10 +182,7 @@
         <w:t>Tương tự po</w:t>
       </w:r>
       <w:r>
-        <w:t xml:space="preserve">p, nhưng </w:t>
-      </w:r>
-      <w:r>
-        <w:t>stash vẫn được giữ lại trong danh sách.</w:t>
+        <w:t>p, nhưng stash vẫn được giữ lại trong danh sách.</w:t>
       </w:r>
     </w:p>
     <w:p>
@@ -205,16 +202,231 @@
     </w:p>
     <w:p>
       <w:r>
+        <w:rPr>
+          <w:noProof/>
+        </w:rPr>
+        <w:drawing>
+          <wp:inline distT="0" distB="0" distL="0" distR="0" wp14:anchorId="784D9918" wp14:editId="53F72C6C">
+            <wp:extent cx="5534797" cy="3524742"/>
+            <wp:effectExtent l="0" t="0" r="0" b="0"/>
+            <wp:docPr id="39201863" name="Picture 1" descr="A computer screen shot of a program&#10;&#10;Description automatically generated"/>
+            <wp:cNvGraphicFramePr>
+              <a:graphicFrameLocks xmlns:a="http://schemas.openxmlformats.org/drawingml/2006/main" noChangeAspect="1"/>
+            </wp:cNvGraphicFramePr>
+            <a:graphic xmlns:a="http://schemas.openxmlformats.org/drawingml/2006/main">
+              <a:graphicData uri="http://schemas.openxmlformats.org/drawingml/2006/picture">
+                <pic:pic xmlns:pic="http://schemas.openxmlformats.org/drawingml/2006/picture">
+                  <pic:nvPicPr>
+                    <pic:cNvPr id="39201863" name="Picture 1" descr="A computer screen shot of a program&#10;&#10;Description automatically generated"/>
+                    <pic:cNvPicPr/>
+                  </pic:nvPicPr>
+                  <pic:blipFill>
+                    <a:blip r:embed="rId5"/>
+                    <a:stretch>
+                      <a:fillRect/>
+                    </a:stretch>
+                  </pic:blipFill>
+                  <pic:spPr>
+                    <a:xfrm>
+                      <a:off x="0" y="0"/>
+                      <a:ext cx="5534797" cy="3524742"/>
+                    </a:xfrm>
+                    <a:prstGeom prst="rect">
+                      <a:avLst/>
+                    </a:prstGeom>
+                  </pic:spPr>
+                </pic:pic>
+              </a:graphicData>
+            </a:graphic>
+          </wp:inline>
+        </w:drawing>
+      </w:r>
+    </w:p>
+    <w:p>
+      <w:r>
+        <w:lastRenderedPageBreak/>
         <w:t>- Trong nhánh MSSV_cpp chứa chương trình kiểm tra 1 số nguyên nhập vào có phải là bội số của 3 không viết bằng C++.</w:t>
       </w:r>
     </w:p>
     <w:p>
       <w:r>
+        <w:rPr>
+          <w:noProof/>
+        </w:rPr>
+        <w:drawing>
+          <wp:inline distT="0" distB="0" distL="0" distR="0" wp14:anchorId="4C700B11" wp14:editId="0165713B">
+            <wp:extent cx="5106113" cy="2248214"/>
+            <wp:effectExtent l="0" t="0" r="0" b="0"/>
+            <wp:docPr id="1199199920" name="Picture 1" descr="A screenshot of a computer code&#10;&#10;Description automatically generated"/>
+            <wp:cNvGraphicFramePr>
+              <a:graphicFrameLocks xmlns:a="http://schemas.openxmlformats.org/drawingml/2006/main" noChangeAspect="1"/>
+            </wp:cNvGraphicFramePr>
+            <a:graphic xmlns:a="http://schemas.openxmlformats.org/drawingml/2006/main">
+              <a:graphicData uri="http://schemas.openxmlformats.org/drawingml/2006/picture">
+                <pic:pic xmlns:pic="http://schemas.openxmlformats.org/drawingml/2006/picture">
+                  <pic:nvPicPr>
+                    <pic:cNvPr id="1199199920" name="Picture 1" descr="A screenshot of a computer code&#10;&#10;Description automatically generated"/>
+                    <pic:cNvPicPr/>
+                  </pic:nvPicPr>
+                  <pic:blipFill>
+                    <a:blip r:embed="rId6"/>
+                    <a:stretch>
+                      <a:fillRect/>
+                    </a:stretch>
+                  </pic:blipFill>
+                  <pic:spPr>
+                    <a:xfrm>
+                      <a:off x="0" y="0"/>
+                      <a:ext cx="5106113" cy="2248214"/>
+                    </a:xfrm>
+                    <a:prstGeom prst="rect">
+                      <a:avLst/>
+                    </a:prstGeom>
+                  </pic:spPr>
+                </pic:pic>
+              </a:graphicData>
+            </a:graphic>
+          </wp:inline>
+        </w:drawing>
+      </w:r>
+    </w:p>
+    <w:p>
+      <w:r>
+        <w:rPr>
+          <w:noProof/>
+        </w:rPr>
+        <w:drawing>
+          <wp:inline distT="0" distB="0" distL="0" distR="0" wp14:anchorId="2BB5A70C" wp14:editId="72D63D31">
+            <wp:extent cx="5391902" cy="1190791"/>
+            <wp:effectExtent l="0" t="0" r="0" b="9525"/>
+            <wp:docPr id="827228754" name="Picture 1" descr="A screenshot of a computer screen&#10;&#10;Description automatically generated"/>
+            <wp:cNvGraphicFramePr>
+              <a:graphicFrameLocks xmlns:a="http://schemas.openxmlformats.org/drawingml/2006/main" noChangeAspect="1"/>
+            </wp:cNvGraphicFramePr>
+            <a:graphic xmlns:a="http://schemas.openxmlformats.org/drawingml/2006/main">
+              <a:graphicData uri="http://schemas.openxmlformats.org/drawingml/2006/picture">
+                <pic:pic xmlns:pic="http://schemas.openxmlformats.org/drawingml/2006/picture">
+                  <pic:nvPicPr>
+                    <pic:cNvPr id="827228754" name="Picture 1" descr="A screenshot of a computer screen&#10;&#10;Description automatically generated"/>
+                    <pic:cNvPicPr/>
+                  </pic:nvPicPr>
+                  <pic:blipFill>
+                    <a:blip r:embed="rId7"/>
+                    <a:stretch>
+                      <a:fillRect/>
+                    </a:stretch>
+                  </pic:blipFill>
+                  <pic:spPr>
+                    <a:xfrm>
+                      <a:off x="0" y="0"/>
+                      <a:ext cx="5391902" cy="1190791"/>
+                    </a:xfrm>
+                    <a:prstGeom prst="rect">
+                      <a:avLst/>
+                    </a:prstGeom>
+                  </pic:spPr>
+                </pic:pic>
+              </a:graphicData>
+            </a:graphic>
+          </wp:inline>
+        </w:drawing>
+      </w:r>
+    </w:p>
+    <w:p>
+      <w:r>
+        <w:rPr>
+          <w:noProof/>
+        </w:rPr>
+        <w:drawing>
+          <wp:inline distT="0" distB="0" distL="0" distR="0" wp14:anchorId="1FF6713C" wp14:editId="4C62C05F">
+            <wp:extent cx="5534797" cy="3524742"/>
+            <wp:effectExtent l="0" t="0" r="0" b="0"/>
+            <wp:docPr id="2143595216" name="Picture 1" descr="A screenshot of a computer&#10;&#10;Description automatically generated"/>
+            <wp:cNvGraphicFramePr>
+              <a:graphicFrameLocks xmlns:a="http://schemas.openxmlformats.org/drawingml/2006/main" noChangeAspect="1"/>
+            </wp:cNvGraphicFramePr>
+            <a:graphic xmlns:a="http://schemas.openxmlformats.org/drawingml/2006/main">
+              <a:graphicData uri="http://schemas.openxmlformats.org/drawingml/2006/picture">
+                <pic:pic xmlns:pic="http://schemas.openxmlformats.org/drawingml/2006/picture">
+                  <pic:nvPicPr>
+                    <pic:cNvPr id="2143595216" name="Picture 1" descr="A screenshot of a computer&#10;&#10;Description automatically generated"/>
+                    <pic:cNvPicPr/>
+                  </pic:nvPicPr>
+                  <pic:blipFill>
+                    <a:blip r:embed="rId8"/>
+                    <a:stretch>
+                      <a:fillRect/>
+                    </a:stretch>
+                  </pic:blipFill>
+                  <pic:spPr>
+                    <a:xfrm>
+                      <a:off x="0" y="0"/>
+                      <a:ext cx="5534797" cy="3524742"/>
+                    </a:xfrm>
+                    <a:prstGeom prst="rect">
+                      <a:avLst/>
+                    </a:prstGeom>
+                  </pic:spPr>
+                </pic:pic>
+              </a:graphicData>
+            </a:graphic>
+          </wp:inline>
+        </w:drawing>
+      </w:r>
+    </w:p>
+    <w:p>
+      <w:r>
+        <w:br w:type="page"/>
+      </w:r>
+    </w:p>
+    <w:p>
+      <w:r>
+        <w:lastRenderedPageBreak/>
         <w:t>- Trong nhánh MSSV_sh chứa chương trình kiểm tra 1 số nguyên nhập vào có phải là bội số của 3 không Shell Script.</w:t>
       </w:r>
     </w:p>
     <w:p>
       <w:r>
+        <w:drawing>
+          <wp:inline distT="0" distB="0" distL="0" distR="0" wp14:anchorId="46E3F6E2" wp14:editId="32831EEF">
+            <wp:extent cx="3677163" cy="2476846"/>
+            <wp:effectExtent l="0" t="0" r="0" b="0"/>
+            <wp:docPr id="694255162" name="Picture 1"/>
+            <wp:cNvGraphicFramePr>
+              <a:graphicFrameLocks xmlns:a="http://schemas.openxmlformats.org/drawingml/2006/main" noChangeAspect="1"/>
+            </wp:cNvGraphicFramePr>
+            <a:graphic xmlns:a="http://schemas.openxmlformats.org/drawingml/2006/main">
+              <a:graphicData uri="http://schemas.openxmlformats.org/drawingml/2006/picture">
+                <pic:pic xmlns:pic="http://schemas.openxmlformats.org/drawingml/2006/picture">
+                  <pic:nvPicPr>
+                    <pic:cNvPr id="694255162" name=""/>
+                    <pic:cNvPicPr/>
+                  </pic:nvPicPr>
+                  <pic:blipFill>
+                    <a:blip r:embed="rId9"/>
+                    <a:stretch>
+                      <a:fillRect/>
+                    </a:stretch>
+                  </pic:blipFill>
+                  <pic:spPr>
+                    <a:xfrm>
+                      <a:off x="0" y="0"/>
+                      <a:ext cx="3677163" cy="2476846"/>
+                    </a:xfrm>
+                    <a:prstGeom prst="rect">
+                      <a:avLst/>
+                    </a:prstGeom>
+                  </pic:spPr>
+                </pic:pic>
+              </a:graphicData>
+            </a:graphic>
+          </wp:inline>
+        </w:drawing>
+      </w:r>
+    </w:p>
+    <w:p/>
+    <w:p>
+      <w:r>
         <w:t>Câu 3.</w:t>
       </w:r>
     </w:p>
@@ -223,6 +435,7 @@
         <w:t>- Trộn 2 nhánh MSSV_cpp và MSSV_sh vào nhánh MSSV của bạn</w:t>
       </w:r>
     </w:p>
+    <w:p/>
     <w:sectPr>
       <w:pgSz w:w="12240" w:h="15840"/>
       <w:pgMar w:top="1440" w:right="1440" w:bottom="1440" w:left="1440" w:header="720" w:footer="720" w:gutter="0"/>
@@ -754,6 +967,7 @@
   <w:style w:type="paragraph" w:default="1" w:styleId="Normal">
     <w:name w:val="Normal"/>
     <w:qFormat/>
+    <w:rsid w:val="001F1E0A"/>
   </w:style>
   <w:style w:type="character" w:default="1" w:styleId="DefaultParagraphFont">
     <w:name w:val="Default Paragraph Font"/>

</xml_diff>